<commit_message>
Added focus node and media query for keyboard detection
</commit_message>
<xml_diff>
--- a/flutter more documents/f20_flutter_context_extras.docx
+++ b/flutter more documents/f20_flutter_context_extras.docx
@@ -2219,6 +2219,736 @@
           <w:szCs w:val="36"/>
         </w:rPr>
         <w:t>),</w:t>
+      </w:r>
+    </w:p>
+    <w:p>
+      <w:pPr>
+        <w:jc w:val="both"/>
+        <w:rPr>
+          <w:sz w:val="36"/>
+          <w:szCs w:val="36"/>
+        </w:rPr>
+      </w:pPr>
+    </w:p>
+    <w:p>
+      <w:pPr>
+        <w:jc w:val="both"/>
+        <w:rPr>
+          <w:b/>
+          <w:bCs/>
+          <w:sz w:val="36"/>
+          <w:szCs w:val="36"/>
+        </w:rPr>
+      </w:pPr>
+      <w:r>
+        <w:rPr>
+          <w:b/>
+          <w:bCs/>
+          <w:sz w:val="36"/>
+          <w:szCs w:val="36"/>
+        </w:rPr>
+        <w:t>Detect Keyboard Visibility Globally:</w:t>
+      </w:r>
+    </w:p>
+    <w:p>
+      <w:pPr>
+        <w:jc w:val="both"/>
+        <w:rPr>
+          <w:sz w:val="36"/>
+          <w:szCs w:val="36"/>
+        </w:rPr>
+      </w:pPr>
+      <w:r>
+        <w:rPr>
+          <w:sz w:val="36"/>
+          <w:szCs w:val="36"/>
+        </w:rPr>
+        <w:t xml:space="preserve"># If we want to know is the keyboard open anywhere in the ap, we use </w:t>
+      </w:r>
+      <w:proofErr w:type="spellStart"/>
+      <w:r>
+        <w:rPr>
+          <w:b/>
+          <w:bCs/>
+          <w:sz w:val="36"/>
+          <w:szCs w:val="36"/>
+        </w:rPr>
+        <w:t>MediaQuery.of</w:t>
+      </w:r>
+      <w:proofErr w:type="spellEnd"/>
+      <w:r>
+        <w:rPr>
+          <w:b/>
+          <w:bCs/>
+          <w:sz w:val="36"/>
+          <w:szCs w:val="36"/>
+        </w:rPr>
+        <w:t>(context</w:t>
+      </w:r>
+      <w:proofErr w:type="gramStart"/>
+      <w:r>
+        <w:rPr>
+          <w:b/>
+          <w:bCs/>
+          <w:sz w:val="36"/>
+          <w:szCs w:val="36"/>
+        </w:rPr>
+        <w:t>).</w:t>
+      </w:r>
+      <w:proofErr w:type="spellStart"/>
+      <w:r>
+        <w:rPr>
+          <w:b/>
+          <w:bCs/>
+          <w:sz w:val="36"/>
+          <w:szCs w:val="36"/>
+        </w:rPr>
+        <w:t>viewInsets</w:t>
+      </w:r>
+      <w:proofErr w:type="spellEnd"/>
+      <w:proofErr w:type="gramEnd"/>
+    </w:p>
+    <w:p>
+      <w:pPr>
+        <w:jc w:val="both"/>
+        <w:rPr>
+          <w:sz w:val="36"/>
+          <w:szCs w:val="36"/>
+        </w:rPr>
+      </w:pPr>
+      <w:r>
+        <w:rPr>
+          <w:sz w:val="36"/>
+          <w:szCs w:val="36"/>
+        </w:rPr>
+        <w:lastRenderedPageBreak/>
+        <w:t xml:space="preserve"># When keyboard opens bottom inset becomes greater than 0 and when closed bottom inset is 0. </w:t>
+      </w:r>
+      <w:proofErr w:type="spellStart"/>
+      <w:r>
+        <w:rPr>
+          <w:b/>
+          <w:bCs/>
+          <w:sz w:val="36"/>
+          <w:szCs w:val="36"/>
+        </w:rPr>
+        <w:t>MediaQuery.of</w:t>
+      </w:r>
+      <w:proofErr w:type="spellEnd"/>
+      <w:r>
+        <w:rPr>
+          <w:b/>
+          <w:bCs/>
+          <w:sz w:val="36"/>
+          <w:szCs w:val="36"/>
+        </w:rPr>
+        <w:t>(…</w:t>
+      </w:r>
+      <w:proofErr w:type="gramStart"/>
+      <w:r>
+        <w:rPr>
+          <w:b/>
+          <w:bCs/>
+          <w:sz w:val="36"/>
+          <w:szCs w:val="36"/>
+        </w:rPr>
+        <w:t>).</w:t>
+      </w:r>
+      <w:proofErr w:type="spellStart"/>
+      <w:r>
+        <w:rPr>
+          <w:b/>
+          <w:bCs/>
+          <w:sz w:val="36"/>
+          <w:szCs w:val="36"/>
+        </w:rPr>
+        <w:t>viewInsets</w:t>
+      </w:r>
+      <w:proofErr w:type="spellEnd"/>
+      <w:proofErr w:type="gramEnd"/>
+      <w:r>
+        <w:rPr>
+          <w:sz w:val="36"/>
+          <w:szCs w:val="36"/>
+        </w:rPr>
+        <w:t xml:space="preserve"> gives us the current bottom inset</w:t>
+      </w:r>
+    </w:p>
+    <w:p>
+      <w:pPr>
+        <w:jc w:val="both"/>
+        <w:rPr>
+          <w:sz w:val="36"/>
+          <w:szCs w:val="36"/>
+        </w:rPr>
+      </w:pPr>
+      <w:r>
+        <w:rPr>
+          <w:sz w:val="36"/>
+          <w:szCs w:val="36"/>
+        </w:rPr>
+        <w:t># We can use it like this:</w:t>
+      </w:r>
+    </w:p>
+    <w:p>
+      <w:pPr>
+        <w:jc w:val="both"/>
+        <w:rPr>
+          <w:b/>
+          <w:bCs/>
+          <w:color w:val="D86DCB" w:themeColor="accent5" w:themeTint="99"/>
+          <w:sz w:val="36"/>
+          <w:szCs w:val="36"/>
+        </w:rPr>
+      </w:pPr>
+      <w:r>
+        <w:rPr>
+          <w:b/>
+          <w:bCs/>
+          <w:color w:val="D86DCB" w:themeColor="accent5" w:themeTint="99"/>
+          <w:sz w:val="36"/>
+          <w:szCs w:val="36"/>
+        </w:rPr>
+        <w:t>…</w:t>
+      </w:r>
+    </w:p>
+    <w:p>
+      <w:pPr>
+        <w:jc w:val="both"/>
+        <w:rPr>
+          <w:b/>
+          <w:bCs/>
+          <w:color w:val="D86DCB" w:themeColor="accent5" w:themeTint="99"/>
+          <w:sz w:val="36"/>
+          <w:szCs w:val="36"/>
+        </w:rPr>
+      </w:pPr>
+      <w:r>
+        <w:rPr>
+          <w:b/>
+          <w:bCs/>
+          <w:color w:val="D86DCB" w:themeColor="accent5" w:themeTint="99"/>
+          <w:sz w:val="36"/>
+          <w:szCs w:val="36"/>
+        </w:rPr>
+        <w:t>@override</w:t>
+      </w:r>
+    </w:p>
+    <w:p>
+      <w:pPr>
+        <w:jc w:val="both"/>
+        <w:rPr>
+          <w:b/>
+          <w:bCs/>
+          <w:color w:val="D86DCB" w:themeColor="accent5" w:themeTint="99"/>
+          <w:sz w:val="36"/>
+          <w:szCs w:val="36"/>
+        </w:rPr>
+      </w:pPr>
+      <w:r>
+        <w:rPr>
+          <w:b/>
+          <w:bCs/>
+          <w:color w:val="D86DCB" w:themeColor="accent5" w:themeTint="99"/>
+          <w:sz w:val="36"/>
+          <w:szCs w:val="36"/>
+        </w:rPr>
+        <w:t xml:space="preserve">Widget </w:t>
+      </w:r>
+      <w:proofErr w:type="gramStart"/>
+      <w:r>
+        <w:rPr>
+          <w:b/>
+          <w:bCs/>
+          <w:color w:val="D86DCB" w:themeColor="accent5" w:themeTint="99"/>
+          <w:sz w:val="36"/>
+          <w:szCs w:val="36"/>
+        </w:rPr>
+        <w:t>build(</w:t>
+      </w:r>
+      <w:proofErr w:type="spellStart"/>
+      <w:proofErr w:type="gramEnd"/>
+      <w:r>
+        <w:rPr>
+          <w:b/>
+          <w:bCs/>
+          <w:color w:val="D86DCB" w:themeColor="accent5" w:themeTint="99"/>
+          <w:sz w:val="36"/>
+          <w:szCs w:val="36"/>
+        </w:rPr>
+        <w:t>BuildContext</w:t>
+      </w:r>
+      <w:proofErr w:type="spellEnd"/>
+      <w:r>
+        <w:rPr>
+          <w:b/>
+          <w:bCs/>
+          <w:color w:val="D86DCB" w:themeColor="accent5" w:themeTint="99"/>
+          <w:sz w:val="36"/>
+          <w:szCs w:val="36"/>
+        </w:rPr>
+        <w:t xml:space="preserve"> context) {</w:t>
+      </w:r>
+    </w:p>
+    <w:p>
+      <w:pPr>
+        <w:jc w:val="both"/>
+        <w:rPr>
+          <w:b/>
+          <w:bCs/>
+          <w:color w:val="D86DCB" w:themeColor="accent5" w:themeTint="99"/>
+          <w:sz w:val="36"/>
+          <w:szCs w:val="36"/>
+        </w:rPr>
+      </w:pPr>
+      <w:r>
+        <w:rPr>
+          <w:b/>
+          <w:bCs/>
+          <w:color w:val="D86DCB" w:themeColor="accent5" w:themeTint="99"/>
+          <w:sz w:val="36"/>
+          <w:szCs w:val="36"/>
+        </w:rPr>
+        <w:t xml:space="preserve">  final bool </w:t>
+      </w:r>
+      <w:proofErr w:type="spellStart"/>
+      <w:r>
+        <w:rPr>
+          <w:b/>
+          <w:bCs/>
+          <w:color w:val="D86DCB" w:themeColor="accent5" w:themeTint="99"/>
+          <w:sz w:val="36"/>
+          <w:szCs w:val="36"/>
+        </w:rPr>
+        <w:t>keyboardOpen</w:t>
+      </w:r>
+      <w:proofErr w:type="spellEnd"/>
+      <w:r>
+        <w:rPr>
+          <w:b/>
+          <w:bCs/>
+          <w:color w:val="D86DCB" w:themeColor="accent5" w:themeTint="99"/>
+          <w:sz w:val="36"/>
+          <w:szCs w:val="36"/>
+        </w:rPr>
+        <w:t xml:space="preserve"> =</w:t>
+      </w:r>
+    </w:p>
+    <w:p>
+      <w:pPr>
+        <w:jc w:val="both"/>
+        <w:rPr>
+          <w:b/>
+          <w:bCs/>
+          <w:color w:val="D86DCB" w:themeColor="accent5" w:themeTint="99"/>
+          <w:sz w:val="36"/>
+          <w:szCs w:val="36"/>
+        </w:rPr>
+      </w:pPr>
+      <w:r>
+        <w:rPr>
+          <w:b/>
+          <w:bCs/>
+          <w:color w:val="D86DCB" w:themeColor="accent5" w:themeTint="99"/>
+          <w:sz w:val="36"/>
+          <w:szCs w:val="36"/>
+        </w:rPr>
+        <w:t xml:space="preserve">      </w:t>
+      </w:r>
+      <w:proofErr w:type="spellStart"/>
+      <w:r>
+        <w:rPr>
+          <w:b/>
+          <w:bCs/>
+          <w:color w:val="D86DCB" w:themeColor="accent5" w:themeTint="99"/>
+          <w:sz w:val="36"/>
+          <w:szCs w:val="36"/>
+        </w:rPr>
+        <w:t>MediaQuery.of</w:t>
+      </w:r>
+      <w:proofErr w:type="spellEnd"/>
+      <w:r>
+        <w:rPr>
+          <w:b/>
+          <w:bCs/>
+          <w:color w:val="D86DCB" w:themeColor="accent5" w:themeTint="99"/>
+          <w:sz w:val="36"/>
+          <w:szCs w:val="36"/>
+        </w:rPr>
+        <w:t>(context</w:t>
+      </w:r>
+      <w:proofErr w:type="gramStart"/>
+      <w:r>
+        <w:rPr>
+          <w:b/>
+          <w:bCs/>
+          <w:color w:val="D86DCB" w:themeColor="accent5" w:themeTint="99"/>
+          <w:sz w:val="36"/>
+          <w:szCs w:val="36"/>
+        </w:rPr>
+        <w:t>).</w:t>
+      </w:r>
+      <w:proofErr w:type="spellStart"/>
+      <w:r>
+        <w:rPr>
+          <w:b/>
+          <w:bCs/>
+          <w:color w:val="D86DCB" w:themeColor="accent5" w:themeTint="99"/>
+          <w:sz w:val="36"/>
+          <w:szCs w:val="36"/>
+        </w:rPr>
+        <w:t>viewInsets.bottom</w:t>
+      </w:r>
+      <w:proofErr w:type="spellEnd"/>
+      <w:proofErr w:type="gramEnd"/>
+      <w:r>
+        <w:rPr>
+          <w:b/>
+          <w:bCs/>
+          <w:color w:val="D86DCB" w:themeColor="accent5" w:themeTint="99"/>
+          <w:sz w:val="36"/>
+          <w:szCs w:val="36"/>
+        </w:rPr>
+        <w:t xml:space="preserve"> &gt; 0;</w:t>
+      </w:r>
+    </w:p>
+    <w:p>
+      <w:pPr>
+        <w:jc w:val="both"/>
+        <w:rPr>
+          <w:b/>
+          <w:bCs/>
+          <w:color w:val="D86DCB" w:themeColor="accent5" w:themeTint="99"/>
+          <w:sz w:val="36"/>
+          <w:szCs w:val="36"/>
+        </w:rPr>
+      </w:pPr>
+      <w:r>
+        <w:rPr>
+          <w:b/>
+          <w:bCs/>
+          <w:color w:val="D86DCB" w:themeColor="accent5" w:themeTint="99"/>
+          <w:sz w:val="36"/>
+          <w:szCs w:val="36"/>
+        </w:rPr>
+        <w:t xml:space="preserve">  return </w:t>
+      </w:r>
+      <w:proofErr w:type="gramStart"/>
+      <w:r>
+        <w:rPr>
+          <w:b/>
+          <w:bCs/>
+          <w:color w:val="D86DCB" w:themeColor="accent5" w:themeTint="99"/>
+          <w:sz w:val="36"/>
+          <w:szCs w:val="36"/>
+        </w:rPr>
+        <w:t>Scaffold(</w:t>
+      </w:r>
+      <w:proofErr w:type="gramEnd"/>
+    </w:p>
+    <w:p>
+      <w:pPr>
+        <w:jc w:val="both"/>
+        <w:rPr>
+          <w:b/>
+          <w:bCs/>
+          <w:color w:val="D86DCB" w:themeColor="accent5" w:themeTint="99"/>
+          <w:sz w:val="36"/>
+          <w:szCs w:val="36"/>
+        </w:rPr>
+      </w:pPr>
+      <w:r>
+        <w:rPr>
+          <w:b/>
+          <w:bCs/>
+          <w:color w:val="D86DCB" w:themeColor="accent5" w:themeTint="99"/>
+          <w:sz w:val="36"/>
+          <w:szCs w:val="36"/>
+        </w:rPr>
+        <w:t xml:space="preserve">    body: </w:t>
+      </w:r>
+      <w:proofErr w:type="gramStart"/>
+      <w:r>
+        <w:rPr>
+          <w:b/>
+          <w:bCs/>
+          <w:color w:val="D86DCB" w:themeColor="accent5" w:themeTint="99"/>
+          <w:sz w:val="36"/>
+          <w:szCs w:val="36"/>
+        </w:rPr>
+        <w:t>Column(</w:t>
+      </w:r>
+      <w:proofErr w:type="gramEnd"/>
+    </w:p>
+    <w:p>
+      <w:pPr>
+        <w:jc w:val="both"/>
+        <w:rPr>
+          <w:b/>
+          <w:bCs/>
+          <w:color w:val="D86DCB" w:themeColor="accent5" w:themeTint="99"/>
+          <w:sz w:val="36"/>
+          <w:szCs w:val="36"/>
+        </w:rPr>
+      </w:pPr>
+      <w:r>
+        <w:rPr>
+          <w:b/>
+          <w:bCs/>
+          <w:color w:val="D86DCB" w:themeColor="accent5" w:themeTint="99"/>
+          <w:sz w:val="36"/>
+          <w:szCs w:val="36"/>
+        </w:rPr>
+        <w:t xml:space="preserve">      children: [</w:t>
+      </w:r>
+    </w:p>
+    <w:p>
+      <w:pPr>
+        <w:jc w:val="both"/>
+        <w:rPr>
+          <w:b/>
+          <w:bCs/>
+          <w:color w:val="D86DCB" w:themeColor="accent5" w:themeTint="99"/>
+          <w:sz w:val="36"/>
+          <w:szCs w:val="36"/>
+        </w:rPr>
+      </w:pPr>
+      <w:r>
+        <w:rPr>
+          <w:b/>
+          <w:bCs/>
+          <w:color w:val="D86DCB" w:themeColor="accent5" w:themeTint="99"/>
+          <w:sz w:val="36"/>
+          <w:szCs w:val="36"/>
+        </w:rPr>
+        <w:t xml:space="preserve">        </w:t>
+      </w:r>
+      <w:proofErr w:type="spellStart"/>
+      <w:proofErr w:type="gramStart"/>
+      <w:r>
+        <w:rPr>
+          <w:b/>
+          <w:bCs/>
+          <w:color w:val="D86DCB" w:themeColor="accent5" w:themeTint="99"/>
+          <w:sz w:val="36"/>
+          <w:szCs w:val="36"/>
+        </w:rPr>
+        <w:t>TextField</w:t>
+      </w:r>
+      <w:proofErr w:type="spellEnd"/>
+      <w:r>
+        <w:rPr>
+          <w:b/>
+          <w:bCs/>
+          <w:color w:val="D86DCB" w:themeColor="accent5" w:themeTint="99"/>
+          <w:sz w:val="36"/>
+          <w:szCs w:val="36"/>
+        </w:rPr>
+        <w:t>(</w:t>
+      </w:r>
+      <w:proofErr w:type="gramEnd"/>
+      <w:r>
+        <w:rPr>
+          <w:b/>
+          <w:bCs/>
+          <w:color w:val="D86DCB" w:themeColor="accent5" w:themeTint="99"/>
+          <w:sz w:val="36"/>
+          <w:szCs w:val="36"/>
+        </w:rPr>
+        <w:t>),</w:t>
+      </w:r>
+    </w:p>
+    <w:p>
+      <w:pPr>
+        <w:jc w:val="both"/>
+        <w:rPr>
+          <w:b/>
+          <w:bCs/>
+          <w:color w:val="D86DCB" w:themeColor="accent5" w:themeTint="99"/>
+          <w:sz w:val="36"/>
+          <w:szCs w:val="36"/>
+        </w:rPr>
+      </w:pPr>
+      <w:r>
+        <w:rPr>
+          <w:b/>
+          <w:bCs/>
+          <w:color w:val="D86DCB" w:themeColor="accent5" w:themeTint="99"/>
+          <w:sz w:val="36"/>
+          <w:szCs w:val="36"/>
+        </w:rPr>
+        <w:t xml:space="preserve">        if (</w:t>
+      </w:r>
+      <w:proofErr w:type="spellStart"/>
+      <w:r>
+        <w:rPr>
+          <w:b/>
+          <w:bCs/>
+          <w:color w:val="D86DCB" w:themeColor="accent5" w:themeTint="99"/>
+          <w:sz w:val="36"/>
+          <w:szCs w:val="36"/>
+        </w:rPr>
+        <w:t>keyboardOpen</w:t>
+      </w:r>
+      <w:proofErr w:type="spellEnd"/>
+      <w:r>
+        <w:rPr>
+          <w:b/>
+          <w:bCs/>
+          <w:color w:val="D86DCB" w:themeColor="accent5" w:themeTint="99"/>
+          <w:sz w:val="36"/>
+          <w:szCs w:val="36"/>
+        </w:rPr>
+        <w:t>)</w:t>
+      </w:r>
+    </w:p>
+    <w:p>
+      <w:pPr>
+        <w:jc w:val="both"/>
+        <w:rPr>
+          <w:b/>
+          <w:bCs/>
+          <w:color w:val="D86DCB" w:themeColor="accent5" w:themeTint="99"/>
+          <w:sz w:val="36"/>
+          <w:szCs w:val="36"/>
+        </w:rPr>
+      </w:pPr>
+      <w:r>
+        <w:rPr>
+          <w:b/>
+          <w:bCs/>
+          <w:color w:val="D86DCB" w:themeColor="accent5" w:themeTint="99"/>
+          <w:sz w:val="36"/>
+          <w:szCs w:val="36"/>
+        </w:rPr>
+        <w:t xml:space="preserve">          </w:t>
+      </w:r>
+      <w:proofErr w:type="gramStart"/>
+      <w:r>
+        <w:rPr>
+          <w:b/>
+          <w:bCs/>
+          <w:color w:val="D86DCB" w:themeColor="accent5" w:themeTint="99"/>
+          <w:sz w:val="36"/>
+          <w:szCs w:val="36"/>
+        </w:rPr>
+        <w:t>Text(</w:t>
+      </w:r>
+      <w:proofErr w:type="gramEnd"/>
+      <w:r>
+        <w:rPr>
+          <w:b/>
+          <w:bCs/>
+          <w:color w:val="D86DCB" w:themeColor="accent5" w:themeTint="99"/>
+          <w:sz w:val="36"/>
+          <w:szCs w:val="36"/>
+        </w:rPr>
+        <w:t>"Keyboard is open")</w:t>
+      </w:r>
+    </w:p>
+    <w:p>
+      <w:pPr>
+        <w:jc w:val="both"/>
+        <w:rPr>
+          <w:b/>
+          <w:bCs/>
+          <w:color w:val="D86DCB" w:themeColor="accent5" w:themeTint="99"/>
+          <w:sz w:val="36"/>
+          <w:szCs w:val="36"/>
+        </w:rPr>
+      </w:pPr>
+      <w:r>
+        <w:rPr>
+          <w:b/>
+          <w:bCs/>
+          <w:color w:val="D86DCB" w:themeColor="accent5" w:themeTint="99"/>
+          <w:sz w:val="36"/>
+          <w:szCs w:val="36"/>
+        </w:rPr>
+        <w:t xml:space="preserve">      …</w:t>
+      </w:r>
+    </w:p>
+    <w:p>
+      <w:pPr>
+        <w:jc w:val="both"/>
+        <w:rPr>
+          <w:b/>
+          <w:bCs/>
+          <w:color w:val="D86DCB" w:themeColor="accent5" w:themeTint="99"/>
+          <w:sz w:val="36"/>
+          <w:szCs w:val="36"/>
+        </w:rPr>
+      </w:pPr>
+      <w:r>
+        <w:rPr>
+          <w:b/>
+          <w:bCs/>
+          <w:color w:val="D86DCB" w:themeColor="accent5" w:themeTint="99"/>
+          <w:sz w:val="36"/>
+          <w:szCs w:val="36"/>
+        </w:rPr>
+        <w:t>}</w:t>
+      </w:r>
+    </w:p>
+    <w:p>
+      <w:pPr>
+        <w:jc w:val="both"/>
+        <w:rPr>
+          <w:sz w:val="36"/>
+          <w:szCs w:val="36"/>
+        </w:rPr>
+      </w:pPr>
+      <w:r>
+        <w:rPr>
+          <w:b/>
+          <w:bCs/>
+          <w:sz w:val="36"/>
+          <w:szCs w:val="36"/>
+        </w:rPr>
+        <w:t xml:space="preserve">NOTE: </w:t>
+      </w:r>
+      <w:r>
+        <w:rPr>
+          <w:sz w:val="36"/>
+          <w:szCs w:val="36"/>
+        </w:rPr>
+        <w:t xml:space="preserve">We also have </w:t>
+      </w:r>
+      <w:proofErr w:type="spellStart"/>
+      <w:r>
+        <w:rPr>
+          <w:b/>
+          <w:bCs/>
+          <w:sz w:val="36"/>
+          <w:szCs w:val="36"/>
+        </w:rPr>
+        <w:t>FocusNode</w:t>
+      </w:r>
+      <w:proofErr w:type="spellEnd"/>
+      <w:r>
+        <w:rPr>
+          <w:sz w:val="36"/>
+          <w:szCs w:val="36"/>
+        </w:rPr>
+        <w:t xml:space="preserve"> for </w:t>
+      </w:r>
+      <w:proofErr w:type="spellStart"/>
+      <w:r>
+        <w:rPr>
+          <w:b/>
+          <w:bCs/>
+          <w:sz w:val="36"/>
+          <w:szCs w:val="36"/>
+        </w:rPr>
+        <w:t>TextField</w:t>
+      </w:r>
+      <w:proofErr w:type="spellEnd"/>
+      <w:r>
+        <w:rPr>
+          <w:sz w:val="36"/>
+          <w:szCs w:val="36"/>
+        </w:rPr>
+        <w:t xml:space="preserve"> widget</w:t>
       </w:r>
     </w:p>
     <w:p>
@@ -2965,6 +3695,7 @@
   <w:style w:type="character" w:default="1" w:styleId="DefaultParagraphFont">
     <w:name w:val="Default Paragraph Font"/>
     <w:uiPriority w:val="1"/>
+    <w:semiHidden/>
     <w:unhideWhenUsed/>
   </w:style>
   <w:style w:type="table" w:default="1" w:styleId="TableNormal">

</xml_diff>